<commit_message>
feat: sidebar compliance progress bar
- Adds a minimalist progress bar at the bottom of the sidebar
  showing global checkbox completion across all 6 NIST phase pages
- Hardcodes per-page checkbox counts (32 total) for accurate tracking
- Updates in real-time when checkboxes are checked/unchecked
- Persisted via localStorage, survives page reloads

Also includes: placeholder cleanup in templates, i18n fixes,
dark mode CSS overrides, duplicate H1 removal, and AGENTS.md
</commit_message>
<xml_diff>
--- a/public/templates/arduradunaren-izendapena.docx
+++ b/public/templates/arduradunaren-izendapena.docx
@@ -2,13 +2,13 @@
 <file path=word/document.xml><?xml version="1.0" encoding="utf-8"?>
 <w:document xmlns:w="http://schemas.openxmlformats.org/wordprocessingml/2006/main" xmlns:m="http://schemas.openxmlformats.org/officeDocument/2006/math" xmlns:r="http://schemas.openxmlformats.org/officeDocument/2006/relationships" xmlns:o="urn:schemas-microsoft-com:office:office" xmlns:v="urn:schemas-microsoft-com:vml" xmlns:w10="urn:schemas-microsoft-com:office:word" xmlns:a="http://schemas.openxmlformats.org/drawingml/2006/main" xmlns:pic="http://schemas.openxmlformats.org/drawingml/2006/picture" xmlns:wp="http://schemas.openxmlformats.org/drawingml/2006/wordprocessingDrawing">
   <w:body>
-    <w:bookmarkStart w:id="26" w:name="arduradunaren-izendapena-schoolname"/>
+    <w:bookmarkStart w:id="26" w:name="arduradunaren-izendapena-_______________"/>
     <w:p>
       <w:pPr>
         <w:pStyle w:val="Heading1"/>
       </w:pPr>
       <w:r>
-        <w:t xml:space="preserve">Arduradunaren izendapena — {{schoolName}}</w:t>
+        <w:t xml:space="preserve">Arduradunaren izendapena — _______________</w:t>
       </w:r>
     </w:p>
     <w:p>
@@ -16,13 +16,31 @@
         <w:pStyle w:val="FirstParagraph"/>
       </w:pPr>
       <w:r>
-        <w:t xml:space="preserve">Data: {{appointmentDate}}</w:t>
-      </w:r>
-      <w:r>
-        <w:t xml:space="preserve"> </w:t>
-      </w:r>
-      <w:r>
-        <w:t xml:space="preserve">Dokumentu-erreferentzia: ZIK-ARD-{{schoolCode}}</w:t>
+        <w:t xml:space="preserve">Data: _____</w:t>
+      </w:r>
+      <w:r>
+        <w:br/>
+      </w:r>
+      <w:r>
+        <w:rPr>
+          <w:bCs/>
+          <w:b/>
+          <w:bCs/>
+          <w:b/>
+          <w:bCs/>
+          <w:b/>
+          <w:bCs/>
+          <w:b/>
+          <w:bCs/>
+          <w:b/>
+          <w:bCs/>
+          <w:b/>
+          <w:bCs/>
+          <w:b/>
+          <w:iCs/>
+          <w:i/>
+        </w:rPr>
+        <w:t xml:space="preserve">Dokumentu-erreferentzia: ZIK-ARD-</w:t>
       </w:r>
     </w:p>
     <w:p>
@@ -46,7 +64,7 @@
         <w:pStyle w:val="FirstParagraph"/>
       </w:pPr>
       <w:r>
-        <w:t xml:space="preserve">{{schoolName}} ikastetxearen zuzendaritzak, indarrean dagoen legedia</w:t>
+        <w:t xml:space="preserve">_______________ ikastetxearen zuzendaritzak, indarrean dagoen legedia</w:t>
       </w:r>
       <w:r>
         <w:t xml:space="preserve"> </w:t>
@@ -92,7 +110,7 @@
           <w:bCs/>
           <w:b/>
         </w:rPr>
-        <w:t xml:space="preserve">{{coordinatorName}}</w:t>
+        <w:t xml:space="preserve">____________________</w:t>
       </w:r>
     </w:p>
     <w:p>
@@ -104,7 +122,7 @@
         <w:pStyle w:val="Compact"/>
       </w:pPr>
       <w:r>
-        <w:t xml:space="preserve">NAN/AIZ: {{coordinatorId}}</w:t>
+        <w:t xml:space="preserve">NAN/AIZ: __________________</w:t>
       </w:r>
     </w:p>
     <w:p>
@@ -116,7 +134,7 @@
         <w:pStyle w:val="Compact"/>
       </w:pPr>
       <w:r>
-        <w:t xml:space="preserve">Kargua: {{coordinatorRole}}</w:t>
+        <w:t xml:space="preserve">Kargua: ____________________</w:t>
       </w:r>
     </w:p>
     <w:p>
@@ -128,7 +146,7 @@
         <w:pStyle w:val="Compact"/>
       </w:pPr>
       <w:r>
-        <w:t xml:space="preserve">Helbide elektronikoa: {{coordinatorEmail}}</w:t>
+        <w:t xml:space="preserve">Helbide elektronikoa: _____________________</w:t>
       </w:r>
     </w:p>
     <w:p>
@@ -140,7 +158,7 @@
         <w:pStyle w:val="Compact"/>
       </w:pPr>
       <w:r>
-        <w:t xml:space="preserve">Telefonoa: {{coordinatorPhone}}</w:t>
+        <w:t xml:space="preserve">Telefonoa: _____________________</w:t>
       </w:r>
     </w:p>
     <w:p>
@@ -909,7 +927,7 @@
         <w:rFonts w:asciiTheme="minorHAnsi" w:cstheme="minorBidi" w:eastAsiaTheme="minorHAnsi" w:hAnsiTheme="minorHAnsi"/>
         <w:sz w:val="24"/>
         <w:szCs w:val="24"/>
-        <w:lang w:bidi="ar-SA" w:eastAsia="en-US" w:val="eu"/>
+        <w:lang w:bidi="ar-SA" w:eastAsia="en-US" w:val="en-US"/>
       </w:rPr>
     </w:rPrDefault>
     <w:pPrDefault>

</xml_diff>